<commit_message>
Added full names to Sprint 2 doc
</commit_message>
<xml_diff>
--- a/documentation/Project Description/Sprint 2.docx
+++ b/documentation/Project Description/Sprint 2.docx
@@ -1124,12 +1124,12 @@
         <w:tblLook w:val="04A0" w:firstRow="1" w:lastRow="0" w:firstColumn="1" w:lastColumn="0" w:noHBand="0" w:noVBand="1"/>
       </w:tblPr>
       <w:tblGrid>
+        <w:gridCol w:w="1417"/>
+        <w:gridCol w:w="1497"/>
+        <w:gridCol w:w="1478"/>
         <w:gridCol w:w="1531"/>
-        <w:gridCol w:w="1546"/>
-        <w:gridCol w:w="1542"/>
-        <w:gridCol w:w="1553"/>
-        <w:gridCol w:w="1640"/>
-        <w:gridCol w:w="1538"/>
+        <w:gridCol w:w="1974"/>
+        <w:gridCol w:w="1453"/>
       </w:tblGrid>
       <w:tr>
         <w:tc>
@@ -1472,7 +1472,25 @@
               <w:rPr>
                 <w:rFonts w:eastAsia="Aptos" w:cs="Times New Roman"/>
               </w:rPr>
-              <w:t>Kyler/Thomas</w:t>
+              <w:t>Kyler</w:t>
+            </w:r>
+            <w:r>
+              <w:rPr>
+                <w:rFonts w:eastAsia="Aptos" w:cs="Times New Roman"/>
+              </w:rPr>
+              <w:t xml:space="preserve"> Cressall</w:t>
+            </w:r>
+            <w:r>
+              <w:rPr>
+                <w:rFonts w:eastAsia="Aptos" w:cs="Times New Roman"/>
+              </w:rPr>
+              <w:t>/Thomas</w:t>
+            </w:r>
+            <w:r>
+              <w:rPr>
+                <w:rFonts w:eastAsia="Aptos" w:cs="Times New Roman"/>
+              </w:rPr>
+              <w:t xml:space="preserve"> Ross</w:t>
             </w:r>
           </w:p>
         </w:tc>
@@ -1583,6 +1601,12 @@
               </w:rPr>
               <w:t>Eric</w:t>
             </w:r>
+            <w:r>
+              <w:rPr>
+                <w:rFonts w:eastAsia="Aptos" w:cs="Times New Roman"/>
+              </w:rPr>
+              <w:t xml:space="preserve"> Parral</w:t>
+            </w:r>
           </w:p>
         </w:tc>
         <w:tc>
@@ -1692,6 +1716,12 @@
               </w:rPr>
               <w:t>Nathan</w:t>
             </w:r>
+            <w:r>
+              <w:rPr>
+                <w:rFonts w:eastAsia="Aptos" w:cs="Times New Roman"/>
+              </w:rPr>
+              <w:t xml:space="preserve"> Carlson</w:t>
+            </w:r>
           </w:p>
         </w:tc>
         <w:tc>
@@ -1919,6 +1949,7 @@
           <w:rFonts w:ascii="Aptos" w:eastAsia="Aptos" w:hAnsi="Aptos" w:cs="Aptos"/>
           <w:szCs w:val="24"/>
         </w:rPr>
+        <w:lastRenderedPageBreak/>
         <w:t>FR-6: The system shall allow users to select a specific station to view detailed information including its address, fuel prices, and a link to open directions in Google Maps.</w:t>
       </w:r>
     </w:p>
@@ -1944,7 +1975,6 @@
           <w:sz w:val="28"/>
           <w:szCs w:val="28"/>
         </w:rPr>
-        <w:lastRenderedPageBreak/>
         <w:t>1.2 Search and Filtering</w:t>
       </w:r>
     </w:p>
@@ -5021,16 +5051,7 @@
           <w:szCs w:val="24"/>
           <w14:ligatures w14:val="none"/>
         </w:rPr>
-        <w:t>Standardized naming conventions by ensuring full names are used consistently throughout the documentation</w:t>
-      </w:r>
-      <w:r>
-        <w:rPr>
-          <w:rFonts w:asciiTheme="minorHAnsi" w:eastAsia="Times New Roman" w:hAnsiTheme="minorHAnsi" w:cs="Times New Roman"/>
-          <w:kern w:val="0"/>
-          <w:szCs w:val="24"/>
-          <w14:ligatures w14:val="none"/>
-        </w:rPr>
-        <w:t>.</w:t>
+        <w:t>Standardized naming conventions by ensuring full names are used consistently throughout the documentation.</w:t>
       </w:r>
     </w:p>
     <w:p>
@@ -5228,16 +5249,7 @@
           <w:szCs w:val="24"/>
           <w14:ligatures w14:val="none"/>
         </w:rPr>
-        <w:t>Expanded unit and integration test coverage for both frontend components and backend APIs</w:t>
-      </w:r>
-      <w:r>
-        <w:rPr>
-          <w:rFonts w:asciiTheme="minorHAnsi" w:eastAsia="Times New Roman" w:hAnsiTheme="minorHAnsi" w:cs="Times New Roman"/>
-          <w:kern w:val="0"/>
-          <w:szCs w:val="24"/>
-          <w14:ligatures w14:val="none"/>
-        </w:rPr>
-        <w:t>.</w:t>
+        <w:t>Expanded unit and integration test coverage for both frontend components and backend APIs.</w:t>
       </w:r>
     </w:p>
     <w:p>
@@ -5382,43 +5394,7 @@
           <w:szCs w:val="24"/>
           <w14:ligatures w14:val="none"/>
         </w:rPr>
-        <w:t xml:space="preserve">. </w:t>
-      </w:r>
-      <w:r>
-        <w:rPr>
-          <w:rFonts w:asciiTheme="minorHAnsi" w:eastAsia="Times New Roman" w:hAnsiTheme="minorHAnsi" w:cs="Times New Roman"/>
-          <w:kern w:val="0"/>
-          <w:szCs w:val="24"/>
-          <w14:ligatures w14:val="none"/>
-        </w:rPr>
-        <w:t xml:space="preserve">This also ensures traceability between </w:t>
-      </w:r>
-      <w:r>
-        <w:rPr>
-          <w:rFonts w:asciiTheme="minorHAnsi" w:eastAsia="Times New Roman" w:hAnsiTheme="minorHAnsi" w:cs="Times New Roman"/>
-          <w:kern w:val="0"/>
-          <w:szCs w:val="24"/>
-          <w14:ligatures w14:val="none"/>
-        </w:rPr>
-        <w:t>functional and non-functional requirements</w:t>
-      </w:r>
-      <w:r>
-        <w:rPr>
-          <w:rFonts w:asciiTheme="minorHAnsi" w:eastAsia="Times New Roman" w:hAnsiTheme="minorHAnsi" w:cs="Times New Roman"/>
-          <w:kern w:val="0"/>
-          <w:szCs w:val="24"/>
-          <w14:ligatures w14:val="none"/>
-        </w:rPr>
-        <w:t xml:space="preserve"> and their corresponding test cases</w:t>
-      </w:r>
-      <w:r>
-        <w:rPr>
-          <w:rFonts w:asciiTheme="minorHAnsi" w:eastAsia="Times New Roman" w:hAnsiTheme="minorHAnsi" w:cs="Times New Roman"/>
-          <w:kern w:val="0"/>
-          <w:szCs w:val="24"/>
-          <w14:ligatures w14:val="none"/>
-        </w:rPr>
-        <w:t>.</w:t>
+        <w:t>. This also ensures traceability between functional and non-functional requirements and their corresponding test cases.</w:t>
       </w:r>
     </w:p>
     <w:p>
@@ -15967,6 +15943,7 @@
   <w:style w:type="character" w:default="1" w:styleId="DefaultParagraphFont">
     <w:name w:val="Default Paragraph Font"/>
     <w:uiPriority w:val="1"/>
+    <w:semiHidden/>
     <w:unhideWhenUsed/>
   </w:style>
   <w:style w:type="table" w:default="1" w:styleId="TableNormal">

</xml_diff>